<commit_message>
Pouvoir AG : heure (20h30) et lieu (Foyer des Vignes)
Co-Authored-By: Claude Opus 5.5 <noreply@anthropic.com>
Claude-Session: https://claude.ai/code/session_01Exig9ihrMP3ZK3bQ57w489
</commit_message>
<xml_diff>
--- a/documents-club/Pouvoir_AG_15-10-2026.docx
+++ b/documents-club/Pouvoir_AG_15-10-2026.docx
@@ -207,7 +207,18 @@
           <w:sz w:val="22"/>
           <w:szCs w:val="22"/>
         </w:rPr>
-        <w:t xml:space="preserve">, à ……… h ………</w:t>
+        <w:t xml:space="preserve">, à </w:t>
+      </w:r>
+      <w:r>
+        <w:rPr>
+          <w:rFonts w:ascii="Comic Sans MS" w:cs="Comic Sans MS" w:eastAsia="Comic Sans MS" w:hAnsi="Comic Sans MS"/>
+          <w:b/>
+          <w:bCs/>
+          <w:color w:val="1C2833"/>
+          <w:sz w:val="22"/>
+          <w:szCs w:val="22"/>
+        </w:rPr>
+        <w:t xml:space="preserve">20h30</w:t>
       </w:r>
     </w:p>
     <w:p>
@@ -233,7 +244,27 @@
           <w:sz w:val="22"/>
           <w:szCs w:val="22"/>
         </w:rPr>
-        <w:t xml:space="preserve">lieu : ............................................................</w:t>
+        <w:t xml:space="preserve">au </w:t>
+      </w:r>
+      <w:r>
+        <w:rPr>
+          <w:rFonts w:ascii="Comic Sans MS" w:cs="Comic Sans MS" w:eastAsia="Comic Sans MS" w:hAnsi="Comic Sans MS"/>
+          <w:b/>
+          <w:bCs/>
+          <w:color w:val="1C2833"/>
+          <w:sz w:val="22"/>
+          <w:szCs w:val="22"/>
+        </w:rPr>
+        <w:t xml:space="preserve">Foyer des Vignes</w:t>
+      </w:r>
+      <w:r>
+        <w:rPr>
+          <w:rFonts w:ascii="Comic Sans MS" w:cs="Comic Sans MS" w:eastAsia="Comic Sans MS" w:hAnsi="Comic Sans MS"/>
+          <w:color w:val="1C2833"/>
+          <w:sz w:val="22"/>
+          <w:szCs w:val="22"/>
+        </w:rPr>
+        <w:t xml:space="preserve">, La Turballe</w:t>
       </w:r>
     </w:p>
     <w:p>

</xml_diff>